<commit_message>
docs: tighten min-19 report layout and peak-aircraft table
Remove the Title-style accent rule, keep the executive summary to
about half a page, stop the scores table splitting across pages,
and list the six forced-core aircraft as table rows.

Co-authored-by: David Long <junlong9@users.noreply.github.com>
</commit_message>
<xml_diff>
--- a/docs/reports/2026-09-17-min19-infeasibility.docx
+++ b/docs/reports/2026-09-17-min19-infeasibility.docx
@@ -94,7 +94,7 @@
           <w:color w:val="000000"/>
           <w:sz w:val="22"/>
         </w:rPr>
-        <w:t>The conclusion does not come from search failure. It follows from a forced-core argument on first D-checks. Each first D must start in a 70-day legal window and lasts 126 days, so every first D occupies a 56-day core [due, due + 56) regardless of start. On the user’s local forecast workbook, six first-D cores coincide on day indices 2676–2681 (20–25 May 2033). The six aircraft are Aircraft 11, 14, 15, 19, 24 and Blue-8. On those days at least six aircraft are in the hangar, so availability is at most 18. No feasible start vector can produce a minimum of 19.</w:t>
+        <w:t>The bound is a forced-core result, not a search failure. Each first D must start in a 70-day legal window and lasts 126 days, so it occupies a 56-day core [due, due + 56) regardless of start. On the user’s local forecast workbook, six first-D cores coincide on day indices 2676–2681 (20–25 May 2033): Aircraft 11, 14, 15, 19, 24 and Blue-8. Availability on those days is at most 18. No feasible start vector can produce a minimum of 19.</w:t>
       </w:r>
     </w:p>
     <w:p>
@@ -110,39 +110,7 @@
           <w:color w:val="000000"/>
           <w:sz w:val="22"/>
         </w:rPr>
-        <w:t>Total hangar load does not explain the bound. The workbook contains 10,248 hangar-days over 4,480 days on a 24-aircraft fleet, which is an average of 2.287 aircraft down and an average availability of 21.713. That average is well inside a five-down budget. The obstruction is a local pile-up of first D-checks, not average capacity.</w:t>
-      </w:r>
-    </w:p>
-    <w:p>
-      <w:pPr>
-        <w:spacing w:before="0" w:after="160" w:line="276" w:lineRule="auto"/>
-        <w:ind w:firstLine="0"/>
-      </w:pPr>
-      <w:r>
-        <w:rPr>
-          <w:rFonts w:ascii="Calibri" w:hAnsi="Calibri" w:cs="Calibri" w:eastAsia="Calibri"/>
-          <w:b w:val="0"/>
-          <w:i w:val="0"/>
-          <w:color w:val="000000"/>
-          <w:sz w:val="22"/>
-        </w:rPr>
-        <w:t>The unoptimised start has minimum 15 (standard deviation 1.950; 20 days at the floor). A frozen hill-climb reaches minimum 18 (standard deviation 1.413971). A local basin-hop also reaches minimum 18, with standard deviation 1.405740. Matching the forced ceiling means the search has already hit the bound.</w:t>
-      </w:r>
-    </w:p>
-    <w:p>
-      <w:pPr>
-        <w:spacing w:before="0" w:after="160" w:line="276" w:lineRule="auto"/>
-        <w:ind w:firstLine="0"/>
-      </w:pPr>
-      <w:r>
-        <w:rPr>
-          <w:rFonts w:ascii="Calibri" w:hAnsi="Calibri" w:cs="Calibri" w:eastAsia="Calibri"/>
-          <w:b w:val="0"/>
-          <w:i w:val="0"/>
-          <w:color w:val="000000"/>
-          <w:sz w:val="22"/>
-        </w:rPr>
-        <w:t>This report uses measurements from the user’s unpublished local workbook. It does not claim a fresh optimiser run in the cloud, and it does not claim that any run produced a minimum of 19.</w:t>
+        <w:t>Average hangar load does not block 19. The workbook contains 10,248 hangar-days over 4,480 days on a 24-aircraft fleet (average 2.287 down; average availability 21.713), well inside a five-down budget. The unoptimised start is minimum 15 (standard deviation 1.950; 20 days at the floor). The frozen hill-climb is minimum 18 (standard deviation 1.413971). A local basin-hop is also minimum 18 (standard deviation 1.405740). Matching the ceiling means the search has already hit the bound. Figures are from the user’s unpublished local workbook. This report does not claim a fresh cloud optimiser run, and it does not claim that any run printed 19.</w:t>
       </w:r>
     </w:p>
     <w:p>
@@ -426,6 +394,9 @@
         <w:gridCol w:w="4819"/>
       </w:tblGrid>
       <w:tr>
+        <w:trPr>
+          <w:cantSplit/>
+        </w:trPr>
         <w:tc>
           <w:tcPr>
             <w:tcW w:type="dxa" w:w="4819"/>
@@ -472,6 +443,9 @@
         </w:tc>
       </w:tr>
       <w:tr>
+        <w:trPr>
+          <w:cantSplit/>
+        </w:trPr>
         <w:tc>
           <w:tcPr>
             <w:tcW w:type="dxa" w:w="4819"/>
@@ -518,6 +492,9 @@
         </w:tc>
       </w:tr>
       <w:tr>
+        <w:trPr>
+          <w:cantSplit/>
+        </w:trPr>
         <w:tc>
           <w:tcPr>
             <w:tcW w:type="dxa" w:w="4819"/>
@@ -564,6 +541,9 @@
         </w:tc>
       </w:tr>
       <w:tr>
+        <w:trPr>
+          <w:cantSplit/>
+        </w:trPr>
         <w:tc>
           <w:tcPr>
             <w:tcW w:type="dxa" w:w="4819"/>
@@ -610,6 +590,9 @@
         </w:tc>
       </w:tr>
       <w:tr>
+        <w:trPr>
+          <w:cantSplit/>
+        </w:trPr>
         <w:tc>
           <w:tcPr>
             <w:tcW w:type="dxa" w:w="4819"/>
@@ -656,6 +639,9 @@
         </w:tc>
       </w:tr>
       <w:tr>
+        <w:trPr>
+          <w:cantSplit/>
+        </w:trPr>
         <w:tc>
           <w:tcPr>
             <w:tcW w:type="dxa" w:w="4819"/>
@@ -702,6 +688,9 @@
         </w:tc>
       </w:tr>
       <w:tr>
+        <w:trPr>
+          <w:cantSplit/>
+        </w:trPr>
         <w:tc>
           <w:tcPr>
             <w:tcW w:type="dxa" w:w="4819"/>
@@ -748,6 +737,9 @@
         </w:tc>
       </w:tr>
       <w:tr>
+        <w:trPr>
+          <w:cantSplit/>
+        </w:trPr>
         <w:tc>
           <w:tcPr>
             <w:tcW w:type="dxa" w:w="4819"/>
@@ -831,6 +823,9 @@
         <w:gridCol w:w="2409"/>
       </w:tblGrid>
       <w:tr>
+        <w:trPr>
+          <w:cantSplit/>
+        </w:trPr>
         <w:tc>
           <w:tcPr>
             <w:tcW w:type="dxa" w:w="2409"/>
@@ -871,7 +866,7 @@
                 <w:color w:val="000000"/>
                 <w:sz w:val="20"/>
               </w:rPr>
-              <w:t>Minimum availability</w:t>
+              <w:t>Minimum</w:t>
             </w:r>
           </w:p>
         </w:tc>
@@ -915,12 +910,15 @@
                 <w:color w:val="000000"/>
                 <w:sz w:val="20"/>
               </w:rPr>
-              <w:t>Other recorded detail</w:t>
+              <w:t>Note</w:t>
             </w:r>
           </w:p>
         </w:tc>
       </w:tr>
       <w:tr>
+        <w:trPr>
+          <w:cantSplit/>
+        </w:trPr>
         <w:tc>
           <w:tcPr>
             <w:tcW w:type="dxa" w:w="2409"/>
@@ -1011,6 +1009,9 @@
         </w:tc>
       </w:tr>
       <w:tr>
+        <w:trPr>
+          <w:cantSplit/>
+        </w:trPr>
         <w:tc>
           <w:tcPr>
             <w:tcW w:type="dxa" w:w="2409"/>
@@ -1101,6 +1102,9 @@
         </w:tc>
       </w:tr>
       <w:tr>
+        <w:trPr>
+          <w:cantSplit/>
+        </w:trPr>
         <w:tc>
           <w:tcPr>
             <w:tcW w:type="dxa" w:w="2409"/>
@@ -1185,7 +1189,7 @@
                 <w:color w:val="000000"/>
                 <w:sz w:val="20"/>
               </w:rPr>
-              <w:t>Other 18-optimum; lower standard deviation</w:t>
+              <w:t>Other 18-optimum</w:t>
             </w:r>
           </w:p>
         </w:tc>
@@ -1397,7 +1401,7 @@
           <w:color w:val="000000"/>
           <w:sz w:val="20"/>
         </w:rPr>
-        <w:t>Table 3. Aircraft on the forced first-D peak</w:t>
+        <w:t>Table 3. Aircraft whose first-D forced cores cover days 2676–2681 (20–25 May 2033). Forced first-D peak = 6; availability ceiling = 18.</w:t>
       </w:r>
     </w:p>
     <w:tbl>
@@ -1416,16 +1420,16 @@
         </w:tblBorders>
       </w:tblPr>
       <w:tblGrid>
-        <w:gridCol w:w="1928"/>
-        <w:gridCol w:w="1928"/>
-        <w:gridCol w:w="1928"/>
-        <w:gridCol w:w="1928"/>
-        <w:gridCol w:w="1928"/>
+        <w:gridCol w:w="4819"/>
+        <w:gridCol w:w="4819"/>
       </w:tblGrid>
       <w:tr>
+        <w:trPr>
+          <w:cantSplit/>
+        </w:trPr>
         <w:tc>
           <w:tcPr>
-            <w:tcW w:type="dxa" w:w="1928"/>
+            <w:tcW w:type="dxa" w:w="4819"/>
             <w:shd w:fill="FFFFFF" w:val="clear"/>
           </w:tcPr>
           <w:p>
@@ -1441,13 +1445,13 @@
                 <w:color w:val="000000"/>
                 <w:sz w:val="20"/>
               </w:rPr>
-              <w:t>Day indices</w:t>
+              <w:t>Aircraft</w:t>
             </w:r>
           </w:p>
         </w:tc>
         <w:tc>
           <w:tcPr>
-            <w:tcW w:type="dxa" w:w="1928"/>
+            <w:tcW w:type="dxa" w:w="4819"/>
             <w:shd w:fill="FFFFFF" w:val="clear"/>
           </w:tcPr>
           <w:p>
@@ -1463,81 +1467,18 @@
                 <w:color w:val="000000"/>
                 <w:sz w:val="20"/>
               </w:rPr>
-              <w:t>Calendar dates</w:t>
-            </w:r>
-          </w:p>
-        </w:tc>
-        <w:tc>
-          <w:tcPr>
-            <w:tcW w:type="dxa" w:w="1928"/>
-            <w:shd w:fill="FFFFFF" w:val="clear"/>
-          </w:tcPr>
-          <w:p>
-            <w:pPr>
-              <w:spacing w:before="40" w:after="40" w:line="259" w:lineRule="auto"/>
-            </w:pPr>
-            <w:r/>
-            <w:r>
-              <w:rPr>
-                <w:rFonts w:ascii="Calibri" w:hAnsi="Calibri" w:cs="Calibri" w:eastAsia="Calibri"/>
-                <w:b/>
-                <w:i w:val="0"/>
-                <w:color w:val="000000"/>
-                <w:sz w:val="20"/>
-              </w:rPr>
-              <w:t>Forced first-D peak</w:t>
-            </w:r>
-          </w:p>
-        </w:tc>
-        <w:tc>
-          <w:tcPr>
-            <w:tcW w:type="dxa" w:w="1928"/>
-            <w:shd w:fill="FFFFFF" w:val="clear"/>
-          </w:tcPr>
-          <w:p>
-            <w:pPr>
-              <w:spacing w:before="40" w:after="40" w:line="259" w:lineRule="auto"/>
-            </w:pPr>
-            <w:r/>
-            <w:r>
-              <w:rPr>
-                <w:rFonts w:ascii="Calibri" w:hAnsi="Calibri" w:cs="Calibri" w:eastAsia="Calibri"/>
-                <w:b/>
-                <w:i w:val="0"/>
-                <w:color w:val="000000"/>
-                <w:sz w:val="20"/>
-              </w:rPr>
-              <w:t>Availability ceiling</w:t>
-            </w:r>
-          </w:p>
-        </w:tc>
-        <w:tc>
-          <w:tcPr>
-            <w:tcW w:type="dxa" w:w="1928"/>
-            <w:shd w:fill="FFFFFF" w:val="clear"/>
-          </w:tcPr>
-          <w:p>
-            <w:pPr>
-              <w:spacing w:before="40" w:after="40" w:line="259" w:lineRule="auto"/>
-            </w:pPr>
-            <w:r/>
-            <w:r>
-              <w:rPr>
-                <w:rFonts w:ascii="Calibri" w:hAnsi="Calibri" w:cs="Calibri" w:eastAsia="Calibri"/>
-                <w:b/>
-                <w:i w:val="0"/>
-                <w:color w:val="000000"/>
-                <w:sz w:val="20"/>
-              </w:rPr>
-              <w:t>Aircraft on those cores</w:t>
+              <w:t>Contribution on the peak days</w:t>
             </w:r>
           </w:p>
         </w:tc>
       </w:tr>
       <w:tr>
+        <w:trPr>
+          <w:cantSplit/>
+        </w:trPr>
         <w:tc>
           <w:tcPr>
-            <w:tcW w:type="dxa" w:w="1928"/>
+            <w:tcW w:type="dxa" w:w="4819"/>
             <w:shd w:fill="FFFFFF" w:val="clear"/>
           </w:tcPr>
           <w:p>
@@ -1553,13 +1494,13 @@
                 <w:color w:val="000000"/>
                 <w:sz w:val="20"/>
               </w:rPr>
-              <w:t>2676–2681</w:t>
+              <w:t>Aircraft 11</w:t>
             </w:r>
           </w:p>
         </w:tc>
         <w:tc>
           <w:tcPr>
-            <w:tcW w:type="dxa" w:w="1928"/>
+            <w:tcW w:type="dxa" w:w="4819"/>
             <w:shd w:fill="FFFFFF" w:val="clear"/>
           </w:tcPr>
           <w:p>
@@ -1575,13 +1516,18 @@
                 <w:color w:val="000000"/>
                 <w:sz w:val="20"/>
               </w:rPr>
-              <w:t>20–25 May 2033</w:t>
+              <w:t>First-D forced core</w:t>
             </w:r>
           </w:p>
         </w:tc>
+      </w:tr>
+      <w:tr>
+        <w:trPr>
+          <w:cantSplit/>
+        </w:trPr>
         <w:tc>
           <w:tcPr>
-            <w:tcW w:type="dxa" w:w="1928"/>
+            <w:tcW w:type="dxa" w:w="4819"/>
             <w:shd w:fill="FFFFFF" w:val="clear"/>
           </w:tcPr>
           <w:p>
@@ -1597,13 +1543,13 @@
                 <w:color w:val="000000"/>
                 <w:sz w:val="20"/>
               </w:rPr>
-              <w:t>6</w:t>
+              <w:t>Aircraft 14</w:t>
             </w:r>
           </w:p>
         </w:tc>
         <w:tc>
           <w:tcPr>
-            <w:tcW w:type="dxa" w:w="1928"/>
+            <w:tcW w:type="dxa" w:w="4819"/>
             <w:shd w:fill="FFFFFF" w:val="clear"/>
           </w:tcPr>
           <w:p>
@@ -1619,13 +1565,18 @@
                 <w:color w:val="000000"/>
                 <w:sz w:val="20"/>
               </w:rPr>
-              <w:t>18</w:t>
+              <w:t>First-D forced core</w:t>
             </w:r>
           </w:p>
         </w:tc>
+      </w:tr>
+      <w:tr>
+        <w:trPr>
+          <w:cantSplit/>
+        </w:trPr>
         <w:tc>
           <w:tcPr>
-            <w:tcW w:type="dxa" w:w="1928"/>
+            <w:tcW w:type="dxa" w:w="4819"/>
             <w:shd w:fill="FFFFFF" w:val="clear"/>
           </w:tcPr>
           <w:p>
@@ -1641,7 +1592,176 @@
                 <w:color w:val="000000"/>
                 <w:sz w:val="20"/>
               </w:rPr>
-              <w:t>Aircraft 11, 14, 15, 19, 24, Blue-8</w:t>
+              <w:t>Aircraft 15</w:t>
+            </w:r>
+          </w:p>
+        </w:tc>
+        <w:tc>
+          <w:tcPr>
+            <w:tcW w:type="dxa" w:w="4819"/>
+            <w:shd w:fill="FFFFFF" w:val="clear"/>
+          </w:tcPr>
+          <w:p>
+            <w:pPr>
+              <w:spacing w:before="40" w:after="40" w:line="259" w:lineRule="auto"/>
+            </w:pPr>
+            <w:r/>
+            <w:r>
+              <w:rPr>
+                <w:rFonts w:ascii="Calibri" w:hAnsi="Calibri" w:cs="Calibri" w:eastAsia="Calibri"/>
+                <w:b w:val="0"/>
+                <w:i w:val="0"/>
+                <w:color w:val="000000"/>
+                <w:sz w:val="20"/>
+              </w:rPr>
+              <w:t>First-D forced core</w:t>
+            </w:r>
+          </w:p>
+        </w:tc>
+      </w:tr>
+      <w:tr>
+        <w:trPr>
+          <w:cantSplit/>
+        </w:trPr>
+        <w:tc>
+          <w:tcPr>
+            <w:tcW w:type="dxa" w:w="4819"/>
+            <w:shd w:fill="FFFFFF" w:val="clear"/>
+          </w:tcPr>
+          <w:p>
+            <w:pPr>
+              <w:spacing w:before="40" w:after="40" w:line="259" w:lineRule="auto"/>
+            </w:pPr>
+            <w:r/>
+            <w:r>
+              <w:rPr>
+                <w:rFonts w:ascii="Calibri" w:hAnsi="Calibri" w:cs="Calibri" w:eastAsia="Calibri"/>
+                <w:b w:val="0"/>
+                <w:i w:val="0"/>
+                <w:color w:val="000000"/>
+                <w:sz w:val="20"/>
+              </w:rPr>
+              <w:t>Aircraft 19</w:t>
+            </w:r>
+          </w:p>
+        </w:tc>
+        <w:tc>
+          <w:tcPr>
+            <w:tcW w:type="dxa" w:w="4819"/>
+            <w:shd w:fill="FFFFFF" w:val="clear"/>
+          </w:tcPr>
+          <w:p>
+            <w:pPr>
+              <w:spacing w:before="40" w:after="40" w:line="259" w:lineRule="auto"/>
+            </w:pPr>
+            <w:r/>
+            <w:r>
+              <w:rPr>
+                <w:rFonts w:ascii="Calibri" w:hAnsi="Calibri" w:cs="Calibri" w:eastAsia="Calibri"/>
+                <w:b w:val="0"/>
+                <w:i w:val="0"/>
+                <w:color w:val="000000"/>
+                <w:sz w:val="20"/>
+              </w:rPr>
+              <w:t>First-D forced core</w:t>
+            </w:r>
+          </w:p>
+        </w:tc>
+      </w:tr>
+      <w:tr>
+        <w:trPr>
+          <w:cantSplit/>
+        </w:trPr>
+        <w:tc>
+          <w:tcPr>
+            <w:tcW w:type="dxa" w:w="4819"/>
+            <w:shd w:fill="FFFFFF" w:val="clear"/>
+          </w:tcPr>
+          <w:p>
+            <w:pPr>
+              <w:spacing w:before="40" w:after="40" w:line="259" w:lineRule="auto"/>
+            </w:pPr>
+            <w:r/>
+            <w:r>
+              <w:rPr>
+                <w:rFonts w:ascii="Calibri" w:hAnsi="Calibri" w:cs="Calibri" w:eastAsia="Calibri"/>
+                <w:b w:val="0"/>
+                <w:i w:val="0"/>
+                <w:color w:val="000000"/>
+                <w:sz w:val="20"/>
+              </w:rPr>
+              <w:t>Aircraft 24</w:t>
+            </w:r>
+          </w:p>
+        </w:tc>
+        <w:tc>
+          <w:tcPr>
+            <w:tcW w:type="dxa" w:w="4819"/>
+            <w:shd w:fill="FFFFFF" w:val="clear"/>
+          </w:tcPr>
+          <w:p>
+            <w:pPr>
+              <w:spacing w:before="40" w:after="40" w:line="259" w:lineRule="auto"/>
+            </w:pPr>
+            <w:r/>
+            <w:r>
+              <w:rPr>
+                <w:rFonts w:ascii="Calibri" w:hAnsi="Calibri" w:cs="Calibri" w:eastAsia="Calibri"/>
+                <w:b w:val="0"/>
+                <w:i w:val="0"/>
+                <w:color w:val="000000"/>
+                <w:sz w:val="20"/>
+              </w:rPr>
+              <w:t>First-D forced core</w:t>
+            </w:r>
+          </w:p>
+        </w:tc>
+      </w:tr>
+      <w:tr>
+        <w:trPr>
+          <w:cantSplit/>
+        </w:trPr>
+        <w:tc>
+          <w:tcPr>
+            <w:tcW w:type="dxa" w:w="4819"/>
+            <w:shd w:fill="FFFFFF" w:val="clear"/>
+          </w:tcPr>
+          <w:p>
+            <w:pPr>
+              <w:spacing w:before="40" w:after="40" w:line="259" w:lineRule="auto"/>
+            </w:pPr>
+            <w:r/>
+            <w:r>
+              <w:rPr>
+                <w:rFonts w:ascii="Calibri" w:hAnsi="Calibri" w:cs="Calibri" w:eastAsia="Calibri"/>
+                <w:b w:val="0"/>
+                <w:i w:val="0"/>
+                <w:color w:val="000000"/>
+                <w:sz w:val="20"/>
+              </w:rPr>
+              <w:t>Blue-8</w:t>
+            </w:r>
+          </w:p>
+        </w:tc>
+        <w:tc>
+          <w:tcPr>
+            <w:tcW w:type="dxa" w:w="4819"/>
+            <w:shd w:fill="FFFFFF" w:val="clear"/>
+          </w:tcPr>
+          <w:p>
+            <w:pPr>
+              <w:spacing w:before="40" w:after="40" w:line="259" w:lineRule="auto"/>
+            </w:pPr>
+            <w:r/>
+            <w:r>
+              <w:rPr>
+                <w:rFonts w:ascii="Calibri" w:hAnsi="Calibri" w:cs="Calibri" w:eastAsia="Calibri"/>
+                <w:b w:val="0"/>
+                <w:i w:val="0"/>
+                <w:color w:val="000000"/>
+                <w:sz w:val="20"/>
+              </w:rPr>
+              <w:t>First-D forced core</w:t>
             </w:r>
           </w:p>
         </w:tc>
@@ -2688,9 +2808,6 @@
     <w:qFormat/>
     <w:rsid w:val="00FC693F"/>
     <w:pPr>
-      <w:pBdr>
-        <w:bottom w:val="single" w:sz="8" w:space="4" w:color="4F81BD" w:themeColor="accent1"/>
-      </w:pBdr>
       <w:spacing w:after="120" w:line="276" w:lineRule="auto" w:before="0"/>
       <w:contextualSpacing/>
     </w:pPr>

</xml_diff>